<commit_message>
docs: update README (Layers 0-4, enrichment keys) and GDPR consent (new processors/data, OSINT minimisation, XSS handling)
</commit_message>
<xml_diff>
--- a/legal/ShipShield_Nutzungsbedingungen_DSGVO.docx
+++ b/legal/ShipShield_Nutzungsbedingungen_DSGVO.docx
@@ -493,7 +493,7 @@
           </w:tcPr>
           <w:p>
             <w:r>
-              <w:t xml:space="preserve">Wird ausschließlich als pseudonymer Hash (HMAC-SHA256) gespeichert — keine Speicherung der Klartext-IBAN (siehe Ziffer 5).</w:t>
+              <w:t xml:space="preserve">Wird ausschließlich als pseudonymer Hash (HMAC-SHA256) gespeichert — keine Speicherung der Klartext-IBAN (siehe Ziffer 5). Gilt auch für die Verification-of-Payee-Prüfung.</w:t>
             </w:r>
           </w:p>
         </w:tc>
@@ -539,7 +539,99 @@
           </w:tcPr>
           <w:p>
             <w:r>
-              <w:t xml:space="preserve">Firmenname des Carriers/Lieferanten. In der Regel keine personenbezogenen Daten; bei Einzelunternehmern ggf. personenbezogen.</w:t>
+              <w:t xml:space="preserve">Firmenname des Carriers/Lieferanten, USt-IdNr. und Handelsregisterdaten. In der Regel keine personenbezogenen Daten; bei Einzelunternehmern ggf. personenbezogen.</w:t>
+            </w:r>
+          </w:p>
+        </w:tc>
+      </w:tr>
+      <w:tr>
+        <w:tc>
+          <w:tcPr>
+            <w:tcW w:type="dxa" w:w="3000"/>
+            <w:tcBorders>
+              <w:top w:val="single" w:color="CCCCCC" w:sz="1"/>
+              <w:left w:val="single" w:color="CCCCCC" w:sz="1"/>
+              <w:bottom w:val="single" w:color="CCCCCC" w:sz="1"/>
+              <w:right w:val="single" w:color="CCCCCC" w:sz="1"/>
+            </w:tcBorders>
+            <w:tcMar>
+              <w:top w:type="dxa" w:w="80"/>
+              <w:left w:type="dxa" w:w="120"/>
+              <w:bottom w:type="dxa" w:w="80"/>
+              <w:right w:type="dxa" w:w="120"/>
+            </w:tcMar>
+          </w:tcPr>
+          <w:p>
+            <w:r>
+              <w:t xml:space="preserve">Sanktions-Screening</w:t>
+            </w:r>
+          </w:p>
+        </w:tc>
+        <w:tc>
+          <w:tcPr>
+            <w:tcW w:type="dxa" w:w="6026"/>
+            <w:tcBorders>
+              <w:top w:val="single" w:color="CCCCCC" w:sz="1"/>
+              <w:left w:val="single" w:color="CCCCCC" w:sz="1"/>
+              <w:bottom w:val="single" w:color="CCCCCC" w:sz="1"/>
+              <w:right w:val="single" w:color="CCCCCC" w:sz="1"/>
+            </w:tcBorders>
+            <w:tcMar>
+              <w:top w:type="dxa" w:w="80"/>
+              <w:left w:type="dxa" w:w="120"/>
+              <w:bottom w:type="dxa" w:w="80"/>
+              <w:right w:type="dxa" w:w="120"/>
+            </w:tcMar>
+          </w:tcPr>
+          <w:p>
+            <w:r>
+              <w:t xml:space="preserve">Abgleich von Namen/Schiffskennungen gegen Sanktionslisten; gespeichert werden nur Trefferstatus und Quelle.</w:t>
+            </w:r>
+          </w:p>
+        </w:tc>
+      </w:tr>
+      <w:tr>
+        <w:tc>
+          <w:tcPr>
+            <w:tcW w:type="dxa" w:w="3000"/>
+            <w:tcBorders>
+              <w:top w:val="single" w:color="CCCCCC" w:sz="1"/>
+              <w:left w:val="single" w:color="CCCCCC" w:sz="1"/>
+              <w:bottom w:val="single" w:color="CCCCCC" w:sz="1"/>
+              <w:right w:val="single" w:color="CCCCCC" w:sz="1"/>
+            </w:tcBorders>
+            <w:tcMar>
+              <w:top w:type="dxa" w:w="80"/>
+              <w:left w:type="dxa" w:w="120"/>
+              <w:bottom w:type="dxa" w:w="80"/>
+              <w:right w:type="dxa" w:w="120"/>
+            </w:tcMar>
+          </w:tcPr>
+          <w:p>
+            <w:r>
+              <w:t xml:space="preserve">Schiffs-/Betreiberdaten</w:t>
+            </w:r>
+          </w:p>
+        </w:tc>
+        <w:tc>
+          <w:tcPr>
+            <w:tcW w:type="dxa" w:w="6026"/>
+            <w:tcBorders>
+              <w:top w:val="single" w:color="CCCCCC" w:sz="1"/>
+              <w:left w:val="single" w:color="CCCCCC" w:sz="1"/>
+              <w:bottom w:val="single" w:color="CCCCCC" w:sz="1"/>
+              <w:right w:val="single" w:color="CCCCCC" w:sz="1"/>
+            </w:tcBorders>
+            <w:tcMar>
+              <w:top w:type="dxa" w:w="80"/>
+              <w:left w:type="dxa" w:w="120"/>
+              <w:bottom w:type="dxa" w:w="80"/>
+              <w:right w:type="dxa" w:w="120"/>
+            </w:tcMar>
+          </w:tcPr>
+          <w:p>
+            <w:r>
+              <w:t xml:space="preserve">MMSI/IMO, Flagge, Klasse, Eigner sowie Hafenstaatkontroll-Historie (Equasis/PSC).</w:t>
             </w:r>
           </w:p>
         </w:tc>
@@ -899,22 +991,6 @@
     </w:p>
     <w:p>
       <w:pPr>
-        <w:pStyle w:val="Heading1"/>
-      </w:pPr>
-      <w:r>
-        <w:t xml:space="preserve">6. Empfänger und Drittlandübermittlung</w:t>
-      </w:r>
-    </w:p>
-    <w:p>
-      <w:pPr>
-        <w:spacing w:after="120"/>
-      </w:pPr>
-      <w:r>
-        <w:t xml:space="preserve">Zur Erbringung der Leistung können Daten an folgende Auftragsverarbeiter bzw. Dienste übermittelt werden:</w:t>
-      </w:r>
-    </w:p>
-    <w:p>
-      <w:pPr>
         <w:pStyle w:val="ListParagraph"/>
         <w:numPr>
           <w:ilvl w:val="0"/>
@@ -923,7 +999,7 @@
         <w:spacing w:after="60"/>
       </w:pPr>
       <w:r>
-        <w:t xml:space="preserve">AIS-/Schiffsdatenanbieter (z. B. MarineTraffic, AISStream) zur Verifizierung von Hafenanläufen — übermittelt werden Schiffskennungen (MMSI/IMO), keine Bankdaten.</w:t>
+        <w:t xml:space="preserve">Datenminimierung gegenüber externen Prüfdiensten (OSINT): An Dritte werden ausschließlich die für die jeweilige Prüfung erforderlichen Kennungen übermittelt (z. B. IMO an AIS/Equasis, Firmenname/USt-IdNr. an Register) — niemals die IBAN oder Dokumentinhalte. Die IBAN verlässt das System nur gegenüber einem vertraglich gebundenen Verification-of-Payee-Anbieter.</w:t>
       </w:r>
     </w:p>
     <w:p>
@@ -936,7 +1012,101 @@
         <w:spacing w:after="60"/>
       </w:pPr>
       <w:r>
+        <w:t xml:space="preserve">Behandlung externer Antworten als nicht vertrauenswürdige Eingaben: Inhalte werden geprüft, nie ausgeführt und vor der Anzeige HTML-escaped (Schutz vor Cross-Site-Scripting).</w:t>
+      </w:r>
+    </w:p>
+    <w:p>
+      <w:pPr>
+        <w:pStyle w:val="Heading1"/>
+      </w:pPr>
+      <w:r>
+        <w:t xml:space="preserve">6. Empfänger und Drittlandübermittlung</w:t>
+      </w:r>
+    </w:p>
+    <w:p>
+      <w:pPr>
+        <w:spacing w:after="120"/>
+      </w:pPr>
+      <w:r>
+        <w:t xml:space="preserve">Zur Erbringung der Leistung können Daten an folgende Auftragsverarbeiter bzw. Dienste übermittelt werden:</w:t>
+      </w:r>
+    </w:p>
+    <w:p>
+      <w:pPr>
+        <w:pStyle w:val="ListParagraph"/>
+        <w:numPr>
+          <w:ilvl w:val="0"/>
+          <w:numId w:val="2"/>
+        </w:numPr>
+        <w:spacing w:after="60"/>
+      </w:pPr>
+      <w:r>
+        <w:t xml:space="preserve">AIS-/Schiffsdatenanbieter (z. B. MarineTraffic, AISStream) zur Verifizierung von Hafenanläufen — übermittelt werden Schiffskennungen (MMSI/IMO), keine Bankdaten.</w:t>
+      </w:r>
+    </w:p>
+    <w:p>
+      <w:pPr>
+        <w:pStyle w:val="ListParagraph"/>
+        <w:numPr>
+          <w:ilvl w:val="0"/>
+          <w:numId w:val="2"/>
+        </w:numPr>
+        <w:spacing w:after="60"/>
+      </w:pPr>
+      <w:r>
         <w:t xml:space="preserve">KI-Dienst zur Dokumentenextraktion (LLM, z. B. Groq/LLaMA) — Verarbeitung von Dokumentinhalten zur Feldextraktion.</w:t>
+      </w:r>
+    </w:p>
+    <w:p>
+      <w:pPr>
+        <w:pStyle w:val="ListParagraph"/>
+        <w:numPr>
+          <w:ilvl w:val="0"/>
+          <w:numId w:val="2"/>
+        </w:numPr>
+        <w:spacing w:after="60"/>
+      </w:pPr>
+      <w:r>
+        <w:t xml:space="preserve">Sanktionslisten-Anbieter (z. B. OpenSanctions/OFAC/EU) — Übermittlung von Namen und Schiffskennungen zum Listenabgleich.</w:t>
+      </w:r>
+    </w:p>
+    <w:p>
+      <w:pPr>
+        <w:pStyle w:val="ListParagraph"/>
+        <w:numPr>
+          <w:ilvl w:val="0"/>
+          <w:numId w:val="2"/>
+        </w:numPr>
+        <w:spacing w:after="60"/>
+      </w:pPr>
+      <w:r>
+        <w:t xml:space="preserve">Schiffsdaten-/Hafenstaatkontroll-Quellen (z. B. Equasis) — Übermittlung von IMO/MMSI.</w:t>
+      </w:r>
+    </w:p>
+    <w:p>
+      <w:pPr>
+        <w:pStyle w:val="ListParagraph"/>
+        <w:numPr>
+          <w:ilvl w:val="0"/>
+          <w:numId w:val="2"/>
+        </w:numPr>
+        <w:spacing w:after="60"/>
+      </w:pPr>
+      <w:r>
+        <w:t xml:space="preserve">USt-/Handelsregister-Dienste (z. B. EU VIES, Handelsregister/Northdata/GLEIF) — Übermittlung von Firmenname/USt-IdNr.</w:t>
+      </w:r>
+    </w:p>
+    <w:p>
+      <w:pPr>
+        <w:pStyle w:val="ListParagraph"/>
+        <w:numPr>
+          <w:ilvl w:val="0"/>
+          <w:numId w:val="2"/>
+        </w:numPr>
+        <w:spacing w:after="60"/>
+      </w:pPr>
+      <w:r>
+        <w:t xml:space="preserve">Verification-of-Payee-/Open-Banking-Anbieter — Abgleich von Kontoinhaber und Lieferant (einziger Dienst, der IBAN-Bezug erhält).</w:t>
       </w:r>
     </w:p>
     <w:p>
@@ -1227,7 +1397,7 @@
         <w:spacing w:after="120"/>
       </w:pPr>
       <w:r>
-        <w:t xml:space="preserve">Email metadata (sender, reply-to, subject, date); document contents (invoices, Bills of Lading and extracted fields); logistics identifiers (vessel, MMSI, IMO, voyage, ports, cargo, tonnage); bank account (IBAN) stored only as a pseudonymous HMAC-SHA256 hash; vendor/company names. Personal data of third parties is processed only to the extent necessary (data minimisation, Art. 5(1)(c)).</w:t>
+        <w:t xml:space="preserve">Email metadata (sender, reply-to, subject, date); document contents (invoices, Bills of Lading and extracted fields); logistics identifiers (vessel, MMSI, IMO, voyage, ports, cargo, tonnage); bank account (IBAN) stored only as a pseudonymous HMAC-SHA256 hash (incl. for Verification of Payee); vendor/company data (name, VAT ID, commercial-register data); sanctions-screening results (match status + source only); vessel/operator data (flag, class, owner, Port State Control history). Personal data of third parties is processed only to the extent necessary (data minimisation, Art. 5(1)(c)).</w:t>
       </w:r>
     </w:p>
     <w:p>
@@ -1264,6 +1434,14 @@
     </w:p>
     <w:p>
       <w:pPr>
+        <w:spacing w:after="120"/>
+      </w:pPr>
+      <w:r>
+        <w:t xml:space="preserve">Data minimisation toward external (OSINT) checks: only the identifiers needed for each check are sent to third parties (e.g. IMO to AIS/Equasis, company name/VAT ID to registers) — never the IBAN or document contents. The IBAN leaves the system only to a contracted Verification-of-Payee provider. External responses are treated as untrusted input: parsed, never executed, and HTML-escaped before display (cross-site-scripting protection).</w:t>
+      </w:r>
+    </w:p>
+    <w:p>
+      <w:pPr>
         <w:pStyle w:val="Heading2"/>
       </w:pPr>
       <w:r>
@@ -1275,7 +1453,7 @@
         <w:spacing w:after="120"/>
       </w:pPr>
       <w:r>
-        <w:t xml:space="preserve">Processors/services may include AIS/vessel-data providers (e.g. MarineTraffic, AISStream — only vessel identifiers shared, no bank data), an AI document-extraction service (LLM, e.g. Groq/LLaMA), and a hosting/cloud provider. Art. 28 processing agreements are in place; transfers outside the EU/EEA are safeguarded by an adequacy decision or EU Standard Contractual Clauses (Art. 44 et seq.). See [Annex 1 – list of processors].</w:t>
+        <w:t xml:space="preserve">Processors/services may include: AIS/vessel-data providers (e.g. MarineTraffic, AISStream) and Port State Control sources (e.g. Equasis) — only vessel identifiers shared; an AI document-extraction service (LLM, e.g. Groq/LLaMA); sanctions-list providers (e.g. OpenSanctions/OFAC/EU) — names and vessel identifiers; VAT/commercial-register services (e.g. EU VIES, Handelsregister/Northdata/GLEIF) — company name/VAT ID; a Verification-of-Payee/open-banking provider (the only service with IBAN exposure); and a hosting/cloud provider. Art. 28 processing agreements are in place; transfers outside the EU/EEA are safeguarded by an adequacy decision or EU Standard Contractual Clauses (Art. 44 et seq.). See [Annex 1 – list of processors].</w:t>
       </w:r>
     </w:p>
     <w:p>

</xml_diff>